<commit_message>
Rewrite the Medequip cover letter to lead with field experience instead of academic detail.
Co-authored-by: Cursor <cursoragent@cursor.com>
</commit_message>
<xml_diff>
--- a/wilson/medequip-rwanda/Wasswa_Wilson_Cover_Letter_Medequip_Biomedical_Engineer.docx
+++ b/wilson/medequip-rwanda/Wasswa_Wilson_Cover_Letter_Medequip_Biomedical_Engineer.docx
@@ -179,7 +179,7 @@
           <w:color w:val="2F2F2F"/>
           <w:sz w:val="21"/>
         </w:rPr>
-        <w:t>I am applying for the Biomedical Engineer job at Medequip Healthcare Ltd in Kigali. You install equipment, keep it running, and train hospital teams across Rwanda and beyond. That is the work I already do on the ground, and I would like to do it with your team.</w:t>
+        <w:t>I am applying for the Biomedical Engineer job at Medequip Healthcare Ltd in Kigali. Your team installs equipment, keeps it running, and trains hospital staff across Rwanda and beyond. That is the work I already do on the ground, and I want to do it with Medequip.</w:t>
       </w:r>
     </w:p>
     <w:p>
@@ -192,7 +192,7 @@
           <w:color w:val="2F2F2F"/>
           <w:sz w:val="21"/>
         </w:rPr>
-        <w:t>I have over 7 years in biomedical equipment work. Academically I hold a BSc in Biomedical Engineering from Makerere University (Second Class Honours - Upper Division, CGPA 3.69), plus UACE from Mengo S.S. and UCE Division I from St. John's Wakiso. I also completed University of Washington Leadership and Management in Health training (2022) and a Greenbridge Java Programming certificate (A+). I started at Norvik Hospital, then spent four years as Biomedical Manager at International Hospital Kampala - installs, maintenance, staff training, and the paperwork that came with COHSASA. After that I managed biomedical programmes for the Gould Family Foundation.</w:t>
+        <w:t>I have over 7 years installing, commissioning, maintaining, and training users on hospital equipment. At Norvik Hospital I serviced diagnostic and monitoring systems. At International Hospital Kampala I spent four years as Biomedical Manager - leading installs of CT, X-ray, oxygen plant, and ICU equipment, running preventive maintenance, training staff, and supporting COHSASA accreditation. I later managed biomedical programmes for the Gould Family Foundation across several facilities.</w:t>
       </w:r>
     </w:p>
     <w:p>
@@ -205,7 +205,7 @@
           <w:color w:val="2F2F2F"/>
           <w:sz w:val="21"/>
         </w:rPr>
-        <w:t>Since March 2025 I have been on personal contracts, installing and maintaining equipment for hospitals that call me in. That includes lab, theatre, and radiology jobs at several hospitals in Congo, including the hospital that serves the Kibali Gold Mine. On the lab side I work with haematology analysers, chemistry analysers, and blood bank machines. Beyond Uganda and Congo, I have also done equipment work in Kenya, Tanzania, and Somaliland - travel, long days on site, and leaving behind working machines plus staff who know how to use them.</w:t>
+        <w:t>Since March 2025 I have worked on personal contracts: installing and maintaining equipment for hospitals that call me in. That includes lab, theatre, and radiology jobs in Congo, among them the hospital that serves the Kibali Gold Mine. On the lab side I handle haematology analysers, chemistry analysers, and blood bank machines. I have done this kind of field work in Uganda, Congo, Kenya, Tanzania, and Somaliland - travel to site, fix or install, train users, and leave clear service notes.</w:t>
       </w:r>
     </w:p>
     <w:p>
@@ -218,7 +218,7 @@
           <w:color w:val="2F2F2F"/>
           <w:sz w:val="21"/>
         </w:rPr>
-        <w:t>If you take me on, you get someone who can walk into a facility, install or fix the equipment - including lab haematology, chemistry, and blood bank systems - train the users, write the service notes, and travel when the job needs it. For me, Medequip offers steady regional work, product training, and a chance to grow with a supplier that already serves hospitals across Rwanda and the region. I speak clear English, I am ready to relocate to Kigali, and I am happy to learn your product lines through international training.</w:t>
+        <w:t>I hold a BSc in Biomedical Engineering from Makerere University, but what I bring Medequip is field experience: show up, install or repair, train the team, document the job, and travel when needed. I speak clear English, I am ready to relocate to Kigali, and I am keen to learn your product lines through international training.</w:t>
       </w:r>
     </w:p>
     <w:p>

</xml_diff>